<commit_message>
Fixing typos & grammar mistakes
</commit_message>
<xml_diff>
--- a/Dunking Biscuits in Tea.docx
+++ b/Dunking Biscuits in Tea.docx
@@ -46,13 +46,22 @@
         <w:t xml:space="preserve">The capillary flow behaviour of </w:t>
       </w:r>
       <w:r>
-        <w:t xml:space="preserve">Digestive, Hobnob and Rich Tea biscuits were investigated used the Washburn equation and machine learning. </w:t>
+        <w:t>Digestive, Hobnob and Rich Tea biscuits were investigated us</w:t>
+      </w:r>
+      <w:r>
+        <w:t>ing</w:t>
+      </w:r>
+      <w:r>
+        <w:t xml:space="preserve"> the Washburn equation and machine learning. </w:t>
       </w:r>
       <w:r>
         <w:t>Effective pore radii</w:t>
       </w:r>
       <w:r>
         <w:t xml:space="preserve"> size</w:t>
+      </w:r>
+      <w:r>
+        <w:t>s</w:t>
       </w:r>
       <w:r>
         <w:t xml:space="preserve"> were found to be </w:t>
@@ -1710,15 +1719,7 @@
         <w:t xml:space="preserve"> r</w:t>
       </w:r>
       <w:r>
-        <w:t xml:space="preserve"> value, </w:t>
-      </w:r>
-      <w:proofErr w:type="spellStart"/>
-      <w:r>
-        <w:t>r_eff</w:t>
-      </w:r>
-      <w:proofErr w:type="spellEnd"/>
-      <w:r>
-        <w:t xml:space="preserve">, </w:t>
+        <w:t xml:space="preserve"> value, r_eff, </w:t>
       </w:r>
       <w:r>
         <w:t>from the dunking data</w:t>
@@ -1754,15 +1755,7 @@
         <w:t>s</w:t>
       </w:r>
       <w:r>
-        <w:t xml:space="preserve">howed no outliers, with their </w:t>
-      </w:r>
-      <w:proofErr w:type="spellStart"/>
-      <w:r>
-        <w:t>r_eff</w:t>
-      </w:r>
-      <w:proofErr w:type="spellEnd"/>
-      <w:r>
-        <w:t xml:space="preserve"> values spread relatively evenly across a compact </w:t>
+        <w:t xml:space="preserve">howed no outliers, with their r_eff values spread relatively evenly across a compact </w:t>
       </w:r>
       <w:r>
         <w:lastRenderedPageBreak/>
@@ -2347,21 +2340,7 @@
         <w:rPr>
           <w:rFonts w:cs="Times New Roman"/>
         </w:rPr>
-        <w:t xml:space="preserve"> and </w:t>
-      </w:r>
-      <w:proofErr w:type="spellStart"/>
-      <w:r>
-        <w:rPr>
-          <w:rFonts w:cs="Times New Roman"/>
-        </w:rPr>
-        <w:t>ReLU</w:t>
-      </w:r>
-      <w:proofErr w:type="spellEnd"/>
-      <w:r>
-        <w:rPr>
-          <w:rFonts w:cs="Times New Roman"/>
-        </w:rPr>
-        <w:t xml:space="preserve"> acti</w:t>
+        <w:t xml:space="preserve"> and ReLU acti</w:t>
       </w:r>
       <w:r>
         <w:rPr>
@@ -2533,16 +2512,8 @@
         <w:rPr>
           <w:rFonts w:cs="Times New Roman"/>
         </w:rPr>
-        <w:t xml:space="preserve">the Washburn equation to calculate </w:t>
-      </w:r>
-      <w:proofErr w:type="spellStart"/>
-      <w:r>
-        <w:rPr>
-          <w:rFonts w:cs="Times New Roman"/>
-        </w:rPr>
-        <w:t>r_eff</w:t>
-      </w:r>
-      <w:proofErr w:type="spellEnd"/>
+        <w:t>the Washburn equation to calculate r_eff</w:t>
+      </w:r>
       <w:r>
         <w:rPr>
           <w:rFonts w:cs="Times New Roman"/>
@@ -2651,21 +2622,7 @@
         <w:rPr>
           <w:rFonts w:cs="Times New Roman"/>
         </w:rPr>
-        <w:t xml:space="preserve"> variable </w:t>
-      </w:r>
-      <w:proofErr w:type="spellStart"/>
-      <w:r>
-        <w:rPr>
-          <w:rFonts w:cs="Times New Roman"/>
-        </w:rPr>
-        <w:t>r_eff</w:t>
-      </w:r>
-      <w:proofErr w:type="spellEnd"/>
-      <w:r>
-        <w:rPr>
-          <w:rFonts w:cs="Times New Roman"/>
-        </w:rPr>
-        <w:t xml:space="preserve">, </w:t>
+        <w:t xml:space="preserve"> variable r_eff, </w:t>
       </w:r>
       <w:r>
         <w:rPr>
@@ -2720,7 +2677,31 @@
         <w:rPr>
           <w:rFonts w:cs="Times New Roman"/>
         </w:rPr>
-        <w:t>around 0.95 by 10 epochs, with the previous achieving around 90 after 20-30.</w:t>
+        <w:t xml:space="preserve">around 0.95 by 10 epochs, with the previous achieving around </w:t>
+      </w:r>
+      <w:r>
+        <w:rPr>
+          <w:rFonts w:cs="Times New Roman"/>
+        </w:rPr>
+        <w:t>0.9</w:t>
+      </w:r>
+      <w:r>
+        <w:rPr>
+          <w:rFonts w:cs="Times New Roman"/>
+        </w:rPr>
+        <w:t xml:space="preserve"> after 20-30</w:t>
+      </w:r>
+      <w:r>
+        <w:rPr>
+          <w:rFonts w:cs="Times New Roman"/>
+        </w:rPr>
+        <w:t xml:space="preserve"> epochs</w:t>
+      </w:r>
+      <w:r>
+        <w:rPr>
+          <w:rFonts w:cs="Times New Roman"/>
+        </w:rPr>
+        <w:t>.</w:t>
       </w:r>
     </w:p>
     <w:p>
@@ -2979,7 +2960,19 @@
         <w:rPr>
           <w:rFonts w:cs="Times New Roman"/>
         </w:rPr>
-        <w:t>, which the regressors must appropriate from 400 training samples</w:t>
+        <w:t>, which the regressors must appro</w:t>
+      </w:r>
+      <w:r>
+        <w:rPr>
+          <w:rFonts w:cs="Times New Roman"/>
+        </w:rPr>
+        <w:t>xim</w:t>
+      </w:r>
+      <w:r>
+        <w:rPr>
+          <w:rFonts w:cs="Times New Roman"/>
+        </w:rPr>
+        <w:t>ate from 400 training samples</w:t>
       </w:r>
       <w:r>
         <w:rPr>
@@ -3322,35 +3315,13 @@
         <w:rPr>
           <w:rFonts w:cs="Times New Roman"/>
         </w:rPr>
-        <w:t xml:space="preserve"> </w:t>
-      </w:r>
-      <w:proofErr w:type="spellStart"/>
-      <w:r>
-        <w:rPr>
-          <w:rFonts w:cs="Times New Roman"/>
-        </w:rPr>
-        <w:t>r_eff</w:t>
-      </w:r>
-      <w:proofErr w:type="spellEnd"/>
-      <w:r>
-        <w:rPr>
-          <w:rFonts w:cs="Times New Roman"/>
-        </w:rPr>
-        <w:t xml:space="preserve">, median </w:t>
-      </w:r>
-      <w:proofErr w:type="spellStart"/>
-      <w:r>
-        <w:rPr>
-          <w:rFonts w:cs="Times New Roman"/>
-        </w:rPr>
-        <w:t>r_eff</w:t>
-      </w:r>
-      <w:proofErr w:type="spellEnd"/>
-      <w:r>
-        <w:rPr>
-          <w:rFonts w:cs="Times New Roman"/>
-        </w:rPr>
-        <w:t>, KDE log likelihood and weighted curve RMSE</w:t>
+        <w:t xml:space="preserve"> r_eff</w:t>
+      </w:r>
+      <w:r>
+        <w:rPr>
+          <w:rFonts w:cs="Times New Roman"/>
+        </w:rPr>
+        <w:t>, median r_eff, KDE log likelihood and weighted curve RMSE</w:t>
       </w:r>
       <w:r>
         <w:rPr>
@@ -3608,15 +3579,7 @@
         <w:t xml:space="preserve">. </w:t>
       </w:r>
       <w:r>
-        <w:t xml:space="preserve">However, </w:t>
-      </w:r>
-      <w:proofErr w:type="spellStart"/>
-      <w:r>
-        <w:t>r_eff</w:t>
-      </w:r>
-      <w:proofErr w:type="spellEnd"/>
-      <w:r>
-        <w:t xml:space="preserve"> is the most efficient </w:t>
+        <w:t xml:space="preserve">However, r_eff is the most efficient </w:t>
       </w:r>
       <w:r>
         <w:t>classifying variable, and its inclusion in the models raises all accuracies above 0.95. It was found that the Rich Tea biscuits had the smallest pore radius</w:t>

</xml_diff>